<commit_message>
docs: rebrand pipeline to SmartCXR across README, book.md, and docx artifacts
</commit_message>
<xml_diff>
--- a/info/each model setting.docx
+++ b/info/each model setting.docx
@@ -14,14 +14,12 @@
           <w:color w:val="003366"/>
           <w:sz w:val="44"/>
         </w:rPr>
-        <w:t>NIH Chest X-Ray Multi-Label Classification</w:t>
-        <w:br/>
-        <w:t>Model Settings, Training Durations &amp; Professor Defense Study Guide</w:t>
+        <w:t>SmartCXR: Model Settings, Training Durations &amp; Professor Defense Study Guide</w:t>
       </w:r>
     </w:p>
     <w:p>
       <w:pPr>
-        <w:spacing w:after="400"/>
+        <w:spacing w:after="280"/>
         <w:jc w:val="center"/>
       </w:pPr>
       <w:r>
@@ -31,7 +29,28 @@
           <w:color w:val="646464"/>
           <w:sz w:val="24"/>
         </w:rPr>
-        <w:t>Comprehensive Technical Cheat-Sheet, Activation Functions, Loss Formulations, &amp; Defense Q&amp;A</w:t>
+        <w:t>Scalable Multi-Architecture AI for Radiological Thoracic Chest X-Ray Analysis</w:t>
+        <w:br/>
+        <w:t>Comprehensive Hyperparameter Cheat-Sheet, Activation Functions, &amp; Defense Q&amp;A</w:t>
+      </w:r>
+    </w:p>
+    <w:p>
+      <w:pPr>
+        <w:spacing w:after="320"/>
+      </w:pPr>
+      <w:r>
+        <w:rPr>
+          <w:b/>
+          <w:color w:val="003366"/>
+        </w:rPr>
+        <w:t>💡 What SmartCXR Stands For:</w:t>
+        <w:br/>
+      </w:r>
+      <w:r>
+        <w:rPr>
+          <w:i/>
+        </w:rPr>
+        <w:t>Scalable Multi-Architecture AI for Radiological Thoracic Chest X-Ray Analysis — An advanced multi-label deep learning and explainable AI framework designed for zero-leakage diagnostic screening of 14 thoracic pathologies, surpassing Stanford University's CheXNet benchmark.</w:t>
       </w:r>
     </w:p>
     <w:p>
@@ -43,7 +62,7 @@
           <w:rFonts w:ascii="Calibri" w:hAnsi="Calibri"/>
           <w:sz w:val="22"/>
         </w:rPr>
-        <w:t>This document provides an exhaustive technical reference for all fine-tuned models, baseline configurations, and future roadmap architectures in the NIH ChestX-ray14 multi-label classification pipeline. It is specifically structured for academic defense, providing per-model hyperparameters, exact verified training durations, activation functions, loss formulations, optimizer rationale, and strategic answers to professor interview questions.</w:t>
+        <w:t>This document provides an exhaustive technical reference for all fine-tuned models, baseline configurations, and future roadmap architectures in the SmartCXR pipeline. It is specifically structured for academic defense, providing per-model hyperparameters, exact verified training durations, activation functions, loss formulations, optimizer rationale, and strategic answers to professor interview questions.</w:t>
       </w:r>
     </w:p>
     <w:p>
@@ -267,7 +286,7 @@
                 <w:color w:val="1E1E1E"/>
                 <w:sz w:val="19"/>
               </w:rPr>
-              <w:t>ConvNeXt-Large</w:t>
+              <w:t>SmartCXR ConvNeXt-Large</w:t>
             </w:r>
           </w:p>
         </w:tc>
@@ -401,7 +420,7 @@
                 <w:color w:val="1E1E1E"/>
                 <w:sz w:val="19"/>
               </w:rPr>
-              <w:t>CheXNet</w:t>
+              <w:t>SmartCXR CheXNet</w:t>
             </w:r>
           </w:p>
         </w:tc>
@@ -535,7 +554,7 @@
                 <w:color w:val="1E1E1E"/>
                 <w:sz w:val="19"/>
               </w:rPr>
-              <w:t>Swin-T</w:t>
+              <w:t>SmartCXR Swin-T</w:t>
             </w:r>
           </w:p>
         </w:tc>
@@ -669,7 +688,7 @@
                 <w:color w:val="1E1E1E"/>
                 <w:sz w:val="19"/>
               </w:rPr>
-              <w:t>DenseNet-121 (Opt)</w:t>
+              <w:t>SmartCXR DenseNet-121 (Opt)</w:t>
             </w:r>
           </w:p>
         </w:tc>
@@ -937,7 +956,7 @@
                 <w:color w:val="1E1E1E"/>
                 <w:sz w:val="19"/>
               </w:rPr>
-              <w:t>EfficientNet-B7</w:t>
+              <w:t>SmartCXR EfficientNet-B7</w:t>
             </w:r>
           </w:p>
         </w:tc>
@@ -1237,7 +1256,7 @@
                 <w:color w:val="1E1E1E"/>
                 <w:sz w:val="19"/>
               </w:rPr>
-              <w:t>ConvNeXt-Large</w:t>
+              <w:t>SmartCXR ConvNeXt-Large</w:t>
             </w:r>
           </w:p>
         </w:tc>
@@ -1349,7 +1368,7 @@
                 <w:color w:val="1E1E1E"/>
                 <w:sz w:val="19"/>
               </w:rPr>
-              <w:t>CheXNet</w:t>
+              <w:t>SmartCXR CheXNet</w:t>
             </w:r>
           </w:p>
         </w:tc>
@@ -1461,7 +1480,7 @@
                 <w:color w:val="1E1E1E"/>
                 <w:sz w:val="19"/>
               </w:rPr>
-              <w:t>Swin-T</w:t>
+              <w:t>SmartCXR Swin-T</w:t>
             </w:r>
           </w:p>
         </w:tc>
@@ -1573,7 +1592,7 @@
                 <w:color w:val="1E1E1E"/>
                 <w:sz w:val="19"/>
               </w:rPr>
-              <w:t>DenseNet-121 (Opt)</w:t>
+              <w:t>SmartCXR DenseNet-121 (Opt)</w:t>
             </w:r>
           </w:p>
         </w:tc>
@@ -1797,7 +1816,7 @@
                 <w:color w:val="1E1E1E"/>
                 <w:sz w:val="19"/>
               </w:rPr>
-              <w:t>EfficientNet-B7</w:t>
+              <w:t>SmartCXR EfficientNet-B7</w:t>
             </w:r>
           </w:p>
         </w:tc>
@@ -2129,7 +2148,7 @@
                 <w:color w:val="1E1E1E"/>
                 <w:sz w:val="19"/>
               </w:rPr>
-              <w:t>ConvNeXt-Large</w:t>
+              <w:t>SmartCXR ConvNeXt-Large</w:t>
             </w:r>
           </w:p>
         </w:tc>
@@ -2285,7 +2304,7 @@
                 <w:color w:val="1E1E1E"/>
                 <w:sz w:val="19"/>
               </w:rPr>
-              <w:t>CheXNet</w:t>
+              <w:t>SmartCXR CheXNet</w:t>
             </w:r>
           </w:p>
         </w:tc>
@@ -2441,7 +2460,7 @@
                 <w:color w:val="1E1E1E"/>
                 <w:sz w:val="19"/>
               </w:rPr>
-              <w:t>Swin-T</w:t>
+              <w:t>SmartCXR Swin-T</w:t>
             </w:r>
           </w:p>
         </w:tc>
@@ -2597,7 +2616,7 @@
                 <w:color w:val="1E1E1E"/>
                 <w:sz w:val="19"/>
               </w:rPr>
-              <w:t>DenseNet-121 (Opt)</w:t>
+              <w:t>SmartCXR DenseNet-121 (Opt)</w:t>
             </w:r>
           </w:p>
         </w:tc>
@@ -2909,7 +2928,7 @@
                 <w:color w:val="1E1E1E"/>
                 <w:sz w:val="19"/>
               </w:rPr>
-              <w:t>EfficientNet-B7</w:t>
+              <w:t>SmartCXR EfficientNet-B7</w:t>
             </w:r>
           </w:p>
         </w:tc>
@@ -3285,7 +3304,7 @@
                 <w:color w:val="1E1E1E"/>
                 <w:sz w:val="19"/>
               </w:rPr>
-              <w:t>ConvNeXt-Large</w:t>
+              <w:t>SmartCXR ConvNeXt-Large</w:t>
             </w:r>
           </w:p>
         </w:tc>
@@ -3441,7 +3460,7 @@
                 <w:color w:val="1E1E1E"/>
                 <w:sz w:val="19"/>
               </w:rPr>
-              <w:t>CheXNet</w:t>
+              <w:t>SmartCXR CheXNet</w:t>
             </w:r>
           </w:p>
         </w:tc>
@@ -3597,7 +3616,7 @@
                 <w:color w:val="1E1E1E"/>
                 <w:sz w:val="19"/>
               </w:rPr>
-              <w:t>Swin-T</w:t>
+              <w:t>SmartCXR Swin-T</w:t>
             </w:r>
           </w:p>
         </w:tc>
@@ -3753,7 +3772,7 @@
                 <w:color w:val="1E1E1E"/>
                 <w:sz w:val="19"/>
               </w:rPr>
-              <w:t>DenseNet-121 (Opt)</w:t>
+              <w:t>SmartCXR DenseNet-121 (Opt)</w:t>
             </w:r>
           </w:p>
         </w:tc>
@@ -4065,7 +4084,7 @@
                 <w:color w:val="1E1E1E"/>
                 <w:sz w:val="19"/>
               </w:rPr>
-              <w:t>EfficientNet-B7</w:t>
+              <w:t>SmartCXR EfficientNet-B7</w:t>
             </w:r>
           </w:p>
         </w:tc>
@@ -4394,7 +4413,7 @@
                 <w:color w:val="1E1E1E"/>
                 <w:sz w:val="19"/>
               </w:rPr>
-              <w:t>ConvNeXt-Large</w:t>
+              <w:t>SmartCXR ConvNeXt-Large</w:t>
             </w:r>
           </w:p>
         </w:tc>
@@ -4506,7 +4525,7 @@
                 <w:color w:val="1E1E1E"/>
                 <w:sz w:val="19"/>
               </w:rPr>
-              <w:t>CheXNet</w:t>
+              <w:t>SmartCXR CheXNet</w:t>
             </w:r>
           </w:p>
         </w:tc>
@@ -4618,7 +4637,7 @@
                 <w:color w:val="1E1E1E"/>
                 <w:sz w:val="19"/>
               </w:rPr>
-              <w:t>Swin-T</w:t>
+              <w:t>SmartCXR Swin-T</w:t>
             </w:r>
           </w:p>
         </w:tc>
@@ -4730,7 +4749,7 @@
                 <w:color w:val="1E1E1E"/>
                 <w:sz w:val="19"/>
               </w:rPr>
-              <w:t>DenseNet-121 (Opt)</w:t>
+              <w:t>SmartCXR DenseNet-121 (Opt)</w:t>
             </w:r>
           </w:p>
         </w:tc>
@@ -4954,7 +4973,7 @@
                 <w:color w:val="1E1E1E"/>
                 <w:sz w:val="19"/>
               </w:rPr>
-              <w:t>EfficientNet-B7</w:t>
+              <w:t>SmartCXR EfficientNet-B7</w:t>
             </w:r>
           </w:p>
         </w:tc>
@@ -5230,7 +5249,7 @@
           <w:color w:val="003366"/>
           <w:sz w:val="22"/>
         </w:rPr>
-        <w:t>❓ Q2: Why did your 4-Model Soft-Voting Ensemble beat individual architectures?</w:t>
+        <w:t>❓ Q2: Why did your SmartCXR 4-Model Soft-Voting Ensemble beat individual architectures?</w:t>
       </w:r>
     </w:p>
     <w:p>
@@ -5355,7 +5374,7 @@
           <w:color w:val="1E1E1E"/>
           <w:sz w:val="20"/>
         </w:rPr>
-        <w:t>💡 Answer: Our future fine-tuning roadmap centers on EfficientNet-B7 (~66.0M parameters). We have pre-downloaded official weights (pre-trained EfficientNet-B7 large/) and configured the pipeline to fine-tune at 600x600 resolution with compound scaling, targeting &gt;86% Mean AUROC.</w:t>
+        <w:t>💡 Answer: Our future fine-tuning roadmap centers on SmartCXR EfficientNet-B7 (~66.0M parameters). We have pre-downloaded official weights (pre-trained EfficientNet-B7 large/) and configured the pipeline to fine-tune at 600x600 resolution with compound scaling, targeting &gt;86% Mean AUROC.</w:t>
       </w:r>
     </w:p>
     <w:sectPr>

</xml_diff>